<commit_message>
Call AGG_DAILY_DISCOUNTS after the sales aggregates on commit
Runs after AGG_DAILY_MENU_SALES when sales are saved. Setup script and
as-built guide updated.

Co-Authored-By: Claude Opus 5.5 <noreply@anthropic.com>
</commit_message>
<xml_diff>
--- a/docs/Sales_Tender_Adjustments_As_Built_Guide.docx
+++ b/docs/Sales_Tender_Adjustments_As_Built_Guide.docx
@@ -4453,7 +4453,7 @@
               <w:rPr>
                 <w:sz w:val="19"/>
               </w:rPr>
-              <w:t>SALES_ADJUSTMENTS → LK_TRADING_DAYS → AGG_DAILY_STORE_SALES → AGG_DAILY_MENU_SALES</w:t>
+              <w:t>SALES_ADJUSTMENTS → LK_TRADING_DAYS → AGG_DAILY_STORE_SALES → AGG_DAILY_MENU_SALES → AGG_DAILY_DISCOUNTS</w:t>
             </w:r>
           </w:p>
         </w:tc>
@@ -4513,7 +4513,7 @@
               <w:rPr>
                 <w:sz w:val="19"/>
               </w:rPr>
-              <w:t>SALES_ADJUSTMENTS → TENDER_ADJUSTMENTS → LK_TRADING_DAYS → AGG_DAILY_STORE_SALES → AGG_DAILY_MENU_SALES → AGG_TENDER_MEDIA_SALES</w:t>
+              <w:t>SALES_ADJUSTMENTS → TENDER_ADJUSTMENTS → LK_TRADING_DAYS → AGG_DAILY_STORE_SALES → AGG_DAILY_MENU_SALES → AGG_DAILY_DISCOUNTS → AGG_TENDER_MEDIA_SALES</w:t>
             </w:r>
           </w:p>
         </w:tc>
@@ -6064,6 +6064,50 @@
                 <w:sz w:val="19"/>
               </w:rPr>
               <w:t>DB_PROC_AGG_MENU_SALES</w:t>
+            </w:r>
+          </w:p>
+        </w:tc>
+      </w:tr>
+      <w:tr>
+        <w:tc>
+          <w:tcPr>
+            <w:tcW w:type="dxa" w:w="3118"/>
+          </w:tcPr>
+          <w:p>
+            <w:r/>
+            <w:r>
+              <w:rPr>
+                <w:sz w:val="19"/>
+              </w:rPr>
+              <w:t>AGG_DAILY_DISCOUNTS</w:t>
+            </w:r>
+          </w:p>
+        </w:tc>
+        <w:tc>
+          <w:tcPr>
+            <w:tcW w:type="dxa" w:w="2551"/>
+          </w:tcPr>
+          <w:p>
+            <w:r/>
+            <w:r>
+              <w:rPr>
+                <w:sz w:val="19"/>
+              </w:rPr>
+              <w:t>Sales saved</w:t>
+            </w:r>
+          </w:p>
+        </w:tc>
+        <w:tc>
+          <w:tcPr>
+            <w:tcW w:type="dxa" w:w="3969"/>
+          </w:tcPr>
+          <w:p>
+            <w:r/>
+            <w:r>
+              <w:rPr>
+                <w:sz w:val="19"/>
+              </w:rPr>
+              <w:t>DB_PROC_AGG_DISCOUNTS</w:t>
             </w:r>
           </w:p>
         </w:tc>
@@ -8769,7 +8813,7 @@
         <w:pStyle w:val="ListNumber"/>
       </w:pPr>
       <w:r>
-        <w:t>Confirm the app owner role has every EDW grant on EDW_PROD (the setup script lists EDW_TEST — run the same grants against EDW_PROD), including all six procedures.</w:t>
+        <w:t>Confirm the app owner role has every EDW grant on EDW_PROD (the setup script lists EDW_TEST — run the same grants against EDW_PROD), including all seven procedures.</w:t>
       </w:r>
     </w:p>
     <w:p>
@@ -8844,7 +8888,7 @@
         <w:pStyle w:val="ListNumber"/>
       </w:pPr>
       <w:r>
-        <w:t>Grant the app owner role SELECT on the mart, SELECT/INSERT on the vault, USAGE on the UDF and the six procedures, and INSERT/SELECT on the audit log. Run once per database (EDW_TEST, EDW_PROD).</w:t>
+        <w:t>Grant the app owner role SELECT on the mart, SELECT/INSERT on the vault, USAGE on the UDF and the seven procedures, and INSERT/SELECT on the audit log. Run once per database (EDW_TEST, EDW_PROD).</w:t>
       </w:r>
     </w:p>
     <w:p>

</xml_diff>

<commit_message>
Require an approved Jira ticket on commit
Commit screen asks for the Jira ticket number (validated as a Jira key) and
a confirmation that it has the required approvals. The ticket is stored at
the start of the audit reason as '<ticket>: <reason>'. Help tab and as-built
guide updated.

Co-Authored-By: Claude Opus 5.5 <noreply@anthropic.com>
</commit_message>
<xml_diff>
--- a/docs/Sales_Tender_Adjustments_As_Built_Guide.docx
+++ b/docs/Sales_Tender_Adjustments_As_Built_Guide.docx
@@ -867,7 +867,7 @@
         <w:pStyle w:val="ListBullet"/>
       </w:pPr>
       <w:r>
-        <w:t>A mandatory audit reason on every commit, stored in the Data Vault, plus an application audit log of every commit attempt (successful or not).</w:t>
+        <w:t>A mandatory approved Jira ticket and audit reason on every commit, stored in the Data Vault, plus an application audit log of every commit attempt (successful or not).</w:t>
       </w:r>
     </w:p>
     <w:p>
@@ -1951,7 +1951,7 @@
               <w:rPr>
                 <w:sz w:val="19"/>
               </w:rPr>
-              <w:t>Summary of what will be written, mandatory audit reason, confirmation tick box, Commit Changes button.</w:t>
+              <w:t>Summary of what will be written, mandatory approved Jira ticket number (with approval confirmation), mandatory audit reason, preview confirmation tick box, Commit Changes button.</w:t>
             </w:r>
           </w:p>
         </w:tc>
@@ -2701,6 +2701,36 @@
               <w:rPr>
                 <w:sz w:val="19"/>
               </w:rPr>
+              <w:t>Jira ticket</w:t>
+            </w:r>
+          </w:p>
+        </w:tc>
+        <w:tc>
+          <w:tcPr>
+            <w:tcW w:type="dxa" w:w="7370"/>
+          </w:tcPr>
+          <w:p>
+            <w:r/>
+            <w:r>
+              <w:rPr>
+                <w:sz w:val="19"/>
+              </w:rPr>
+              <w:t>Mandatory on every commit, in Jira key format (e.g. DATA-1234, upper-cased). The ticket must already have the required approvals; the user confirms this with a tick box.</w:t>
+            </w:r>
+          </w:p>
+        </w:tc>
+      </w:tr>
+      <w:tr>
+        <w:tc>
+          <w:tcPr>
+            <w:tcW w:type="dxa" w:w="2268"/>
+          </w:tcPr>
+          <w:p>
+            <w:r/>
+            <w:r>
+              <w:rPr>
+                <w:sz w:val="19"/>
+              </w:rPr>
               <w:t>Audit reason</w:t>
             </w:r>
           </w:p>
@@ -2715,7 +2745,7 @@
               <w:rPr>
                 <w:sz w:val="19"/>
               </w:rPr>
-              <w:t>Mandatory on every commit, max 1,000 characters.</w:t>
+              <w:t>Mandatory on every commit, max 1,000 characters. Stored as "&lt;ticket&gt;: &lt;reason&gt;" in S_ADJUSTMENTS_AUDIT.AUDIT_NOTE and the app audit log, and shown on the Store &amp; Date tab.</w:t>
             </w:r>
           </w:p>
         </w:tc>
@@ -3631,7 +3661,7 @@
         <w:pStyle w:val="ListBullet"/>
       </w:pPr>
       <w:r>
-        <w:t>On click: an audit reason is entered and the confirmation box is ticked.</w:t>
+        <w:t>On click: a valid Jira ticket number is entered and its approvals confirmed, an audit reason is entered, and the preview confirmation box is ticked.</w:t>
       </w:r>
     </w:p>
     <w:p>
@@ -6358,7 +6388,7 @@
               <w:rPr>
                 <w:sz w:val="19"/>
               </w:rPr>
-              <w:t>The user's audit reason</w:t>
+              <w:t>Jira ticket and audit reason: &lt;ticket&gt;: &lt;reason&gt;</w:t>
             </w:r>
           </w:p>
         </w:tc>

</xml_diff>